<commit_message>
Agregando codigo a documentos
</commit_message>
<xml_diff>
--- a/CodigoDoc/BIZ/IURIS_BIZ.docx
+++ b/CodigoDoc/BIZ/IURIS_BIZ.docx
@@ -822,7 +822,11 @@
     <w:sdt>
       <w:sdtPr>
         <w:rPr>
-          <w:lang w:val="es-ES"/>
+          <w:rFonts w:asciiTheme="minorHAnsi" w:eastAsiaTheme="minorHAnsi" w:hAnsiTheme="minorHAnsi" w:cstheme="minorBidi"/>
+          <w:color w:val="auto"/>
+          <w:sz w:val="22"/>
+          <w:szCs w:val="22"/>
+          <w:lang w:val="es-ES" w:eastAsia="en-US"/>
         </w:rPr>
         <w:id w:val="1047258359"/>
         <w:docPartObj>
@@ -832,13 +836,8 @@
       </w:sdtPr>
       <w:sdtEndPr>
         <w:rPr>
-          <w:rFonts w:asciiTheme="minorHAnsi" w:eastAsiaTheme="minorHAnsi" w:hAnsiTheme="minorHAnsi" w:cstheme="minorBidi"/>
           <w:b/>
           <w:bCs/>
-          <w:color w:val="auto"/>
-          <w:sz w:val="22"/>
-          <w:szCs w:val="22"/>
-          <w:lang w:eastAsia="en-US"/>
         </w:rPr>
       </w:sdtEndPr>
       <w:sdtContent>

</xml_diff>